<commit_message>
feat: revert to clean photo ID card layout with real face; split signature into its own image
- make_id_card: blue-header UK identity-card layout (Surname/Given/DOB/Doc No/Nationality) with a real GAN face in the photo box
- Drop the DVLA purple-licence renderer and dead guilloche helper + unused math import
- Signature emitted as a separate isolated SIGNATURE image below the card
- Regions: ID/FACE/TEXT_PII on the card, SIGNATURE on the signature image
- Ignore *_redacted_*.pdf pipeline test outputs
</commit_message>
<xml_diff>
--- a/dataset/docs/doc_0002/doc_0002.docx
+++ b/dataset/docs/doc_0002/doc_0002.docx
@@ -58,7 +58,7 @@
     <w:p/>
     <w:p>
       <w:r>
-        <w:t>Identity verified by UK driving licence (scan attached below).</w:t>
+        <w:t>Identity verified by photo ID card (scan attached below).</w:t>
       </w:r>
     </w:p>
     <w:p/>
@@ -75,9 +75,15 @@
     <w:p/>
     <w:p>
       <w:r>
+        <w:t>Signed (employee signature below):</w:t>
+      </w:r>
+    </w:p>
+    <w:p/>
+    <w:p>
+      <w:r>
         <w:drawing>
           <wp:inline xmlns:a="http://schemas.openxmlformats.org/drawingml/2006/main" xmlns:pic="http://schemas.openxmlformats.org/drawingml/2006/picture">
-            <wp:extent cx="4572000" cy="2882348"/>
+            <wp:extent cx="4572000" cy="2857500"/>
             <wp:docPr id="1" name="Picture 1"/>
             <wp:cNvGraphicFramePr>
               <a:graphicFrameLocks noChangeAspect="1"/>
@@ -86,7 +92,7 @@
               <a:graphicData uri="http://schemas.openxmlformats.org/drawingml/2006/picture">
                 <pic:pic>
                   <pic:nvPicPr>
-                    <pic:cNvPr id="0" name="driving_licence.png"/>
+                    <pic:cNvPr id="0" name="id_card.png"/>
                     <pic:cNvPicPr/>
                   </pic:nvPicPr>
                   <pic:blipFill>
@@ -98,7 +104,43 @@
                   <pic:spPr>
                     <a:xfrm>
                       <a:off x="0" y="0"/>
-                      <a:ext cx="4572000" cy="2882348"/>
+                      <a:ext cx="4572000" cy="2857500"/>
+                    </a:xfrm>
+                    <a:prstGeom prst="rect"/>
+                  </pic:spPr>
+                </pic:pic>
+              </a:graphicData>
+            </a:graphic>
+          </wp:inline>
+        </w:drawing>
+      </w:r>
+    </w:p>
+    <w:p>
+      <w:r>
+        <w:drawing>
+          <wp:inline xmlns:a="http://schemas.openxmlformats.org/drawingml/2006/main" xmlns:pic="http://schemas.openxmlformats.org/drawingml/2006/picture">
+            <wp:extent cx="4572000" cy="1758462"/>
+            <wp:docPr id="2" name="Picture 2"/>
+            <wp:cNvGraphicFramePr>
+              <a:graphicFrameLocks noChangeAspect="1"/>
+            </wp:cNvGraphicFramePr>
+            <a:graphic>
+              <a:graphicData uri="http://schemas.openxmlformats.org/drawingml/2006/picture">
+                <pic:pic>
+                  <pic:nvPicPr>
+                    <pic:cNvPr id="0" name="signature.png"/>
+                    <pic:cNvPicPr/>
+                  </pic:nvPicPr>
+                  <pic:blipFill>
+                    <a:blip r:embed="rId10"/>
+                    <a:stretch>
+                      <a:fillRect/>
+                    </a:stretch>
+                  </pic:blipFill>
+                  <pic:spPr>
+                    <a:xfrm>
+                      <a:off x="0" y="0"/>
+                      <a:ext cx="4572000" cy="1758462"/>
                     </a:xfrm>
                     <a:prstGeom prst="rect"/>
                   </pic:spPr>

</xml_diff>